<commit_message>
feat: Updated my CV.
</commit_message>
<xml_diff>
--- a/EamonnDuffyCV-Long.docx
+++ b/EamonnDuffyCV-Long.docx
@@ -1,6 +1,6 @@
 
 <file path=word/document.xml><?xml version="1.0" encoding="utf-8"?>
-<w:document xmlns:wpc="http://schemas.microsoft.com/office/word/2010/wordprocessingCanvas" xmlns:cx="http://schemas.microsoft.com/office/drawing/2014/chartex" xmlns:cx1="http://schemas.microsoft.com/office/drawing/2015/9/8/chartex" xmlns:cx2="http://schemas.microsoft.com/office/drawing/2015/10/21/chartex" xmlns:cx3="http://schemas.microsoft.com/office/drawing/2016/5/9/chartex" xmlns:cx4="http://schemas.microsoft.com/office/drawing/2016/5/10/chartex" xmlns:cx5="http://schemas.microsoft.com/office/drawing/2016/5/11/chartex" xmlns:cx6="http://schemas.microsoft.com/office/drawing/2016/5/12/chartex" xmlns:cx7="http://schemas.microsoft.com/office/drawing/2016/5/13/chartex" xmlns:cx8="http://schemas.microsoft.com/office/drawing/2016/5/14/chartex" xmlns:mc="http://schemas.openxmlformats.org/markup-compatibility/2006" xmlns:aink="http://schemas.microsoft.com/office/drawing/2016/ink" xmlns:am3d="http://schemas.microsoft.com/office/drawing/2017/model3d" xmlns:o="urn:schemas-microsoft-com:office:office" xmlns:oel="http://schemas.microsoft.com/office/2019/extlst" xmlns:r="http://schemas.openxmlformats.org/officeDocument/2006/relationships" xmlns:m="http://schemas.openxmlformats.org/officeDocument/2006/math" xmlns:v="urn:schemas-microsoft-com:vml" xmlns:wp14="http://schemas.microsoft.com/office/word/2010/wordprocessingDrawing" xmlns:wp="http://schemas.openxmlformats.org/drawingml/2006/wordprocessingDrawing" xmlns:w10="urn:schemas-microsoft-com:office:word" xmlns:w="http://schemas.openxmlformats.org/wordprocessingml/2006/main" xmlns:w14="http://schemas.microsoft.com/office/word/2010/wordml" xmlns:w15="http://schemas.microsoft.com/office/word/2012/wordml" xmlns:w16cex="http://schemas.microsoft.com/office/word/2018/wordml/cex" xmlns:w16cid="http://schemas.microsoft.com/office/word/2016/wordml/cid" xmlns:w16="http://schemas.microsoft.com/office/word/2018/wordml" xmlns:w16sdtdh="http://schemas.microsoft.com/office/word/2020/wordml/sdtdatahash" xmlns:w16se="http://schemas.microsoft.com/office/word/2015/wordml/symex" xmlns:wpg="http://schemas.microsoft.com/office/word/2010/wordprocessingGroup" xmlns:wpi="http://schemas.microsoft.com/office/word/2010/wordprocessingInk" xmlns:wne="http://schemas.microsoft.com/office/word/2006/wordml" xmlns:wps="http://schemas.microsoft.com/office/word/2010/wordprocessingShape" mc:Ignorable="w14 w15 w16se w16cid w16 w16cex w16sdtdh wp14">
+<w:document xmlns:wpc="http://schemas.microsoft.com/office/word/2010/wordprocessingCanvas" xmlns:cx="http://schemas.microsoft.com/office/drawing/2014/chartex" xmlns:cx1="http://schemas.microsoft.com/office/drawing/2015/9/8/chartex" xmlns:cx2="http://schemas.microsoft.com/office/drawing/2015/10/21/chartex" xmlns:cx3="http://schemas.microsoft.com/office/drawing/2016/5/9/chartex" xmlns:cx4="http://schemas.microsoft.com/office/drawing/2016/5/10/chartex" xmlns:cx5="http://schemas.microsoft.com/office/drawing/2016/5/11/chartex" xmlns:cx6="http://schemas.microsoft.com/office/drawing/2016/5/12/chartex" xmlns:cx7="http://schemas.microsoft.com/office/drawing/2016/5/13/chartex" xmlns:cx8="http://schemas.microsoft.com/office/drawing/2016/5/14/chartex" xmlns:mc="http://schemas.openxmlformats.org/markup-compatibility/2006" xmlns:aink="http://schemas.microsoft.com/office/drawing/2016/ink" xmlns:am3d="http://schemas.microsoft.com/office/drawing/2017/model3d" xmlns:o="urn:schemas-microsoft-com:office:office" xmlns:oel="http://schemas.microsoft.com/office/2019/extlst" xmlns:r="http://schemas.openxmlformats.org/officeDocument/2006/relationships" xmlns:m="http://schemas.openxmlformats.org/officeDocument/2006/math" xmlns:v="urn:schemas-microsoft-com:vml" xmlns:wp14="http://schemas.microsoft.com/office/word/2010/wordprocessingDrawing" xmlns:wp="http://schemas.openxmlformats.org/drawingml/2006/wordprocessingDrawing" xmlns:w10="urn:schemas-microsoft-com:office:word" xmlns:w="http://schemas.openxmlformats.org/wordprocessingml/2006/main" xmlns:w14="http://schemas.microsoft.com/office/word/2010/wordml" xmlns:w15="http://schemas.microsoft.com/office/word/2012/wordml" xmlns:w16cex="http://schemas.microsoft.com/office/word/2018/wordml/cex" xmlns:w16cid="http://schemas.microsoft.com/office/word/2016/wordml/cid" xmlns:w16="http://schemas.microsoft.com/office/word/2018/wordml" xmlns:w16du="http://schemas.microsoft.com/office/word/2023/wordml/word16du" xmlns:w16sdtdh="http://schemas.microsoft.com/office/word/2020/wordml/sdtdatahash" xmlns:w16sdtfl="http://schemas.microsoft.com/office/word/2024/wordml/sdtformatlock" xmlns:w16se="http://schemas.microsoft.com/office/word/2015/wordml/symex" xmlns:wpg="http://schemas.microsoft.com/office/word/2010/wordprocessingGroup" xmlns:wpi="http://schemas.microsoft.com/office/word/2010/wordprocessingInk" xmlns:wne="http://schemas.microsoft.com/office/word/2006/wordml" xmlns:wps="http://schemas.microsoft.com/office/word/2010/wordprocessingShape" mc:Ignorable="w14 w15 w16se w16cid w16 w16cex w16sdtdh w16sdtfl w16du wp14">
   <w:body>
     <w:p>
       <w:pPr>
@@ -365,14 +365,35 @@
                 <w:sz w:val="24"/>
                 <w:szCs w:val="24"/>
               </w:rPr>
+              <w:t xml:space="preserve"> Novice/Intermediate: </w:t>
+            </w:r>
+            <w:r>
+              <w:rPr>
+                <w:sz w:val="24"/>
+                <w:szCs w:val="24"/>
+              </w:rPr>
+              <w:t xml:space="preserve">Claude; </w:t>
+            </w:r>
+            <w:r>
+              <w:rPr>
+                <w:sz w:val="24"/>
+                <w:szCs w:val="24"/>
+              </w:rPr>
+              <w:t>Copilot</w:t>
+            </w:r>
+            <w:r>
+              <w:rPr>
+                <w:sz w:val="24"/>
+                <w:szCs w:val="24"/>
+              </w:rPr>
+              <w:t>;</w:t>
+            </w:r>
+            <w:r>
+              <w:rPr>
+                <w:sz w:val="24"/>
+                <w:szCs w:val="24"/>
+              </w:rPr>
               <w:t xml:space="preserve"> </w:t>
-            </w:r>
-            <w:r>
-              <w:rPr>
-                <w:sz w:val="24"/>
-                <w:szCs w:val="24"/>
-              </w:rPr>
-              <w:t xml:space="preserve">Novice/Intermediate: </w:t>
             </w:r>
             <w:r>
               <w:rPr>
@@ -539,7 +560,7 @@
                 <w:lang w:val="en-GB"/>
               </w:rPr>
             </w:pPr>
-            <w:hyperlink r:id="rId7" w:history="1">
+            <w:hyperlink r:id="rId8" w:history="1">
               <w:r>
                 <w:rPr>
                   <w:rStyle w:val="Hyperlink"/>
@@ -616,8 +637,7 @@
                 <w:szCs w:val="24"/>
               </w:rPr>
             </w:pPr>
-            <w:hyperlink r:id="rId8" w:history="1">
-              <w:proofErr w:type="spellStart"/>
+            <w:hyperlink r:id="rId9" w:history="1">
               <w:r>
                 <w:rPr>
                   <w:rStyle w:val="Hyperlink"/>
@@ -625,7 +645,6 @@
                 </w:rPr>
                 <w:t>Payzone</w:t>
               </w:r>
-              <w:proofErr w:type="spellEnd"/>
               <w:r>
                 <w:rPr>
                   <w:rStyle w:val="Hyperlink"/>
@@ -710,23 +729,13 @@
                 <w:lang w:val="en-GB"/>
               </w:rPr>
             </w:pPr>
-            <w:proofErr w:type="spellStart"/>
-            <w:r>
-              <w:rPr>
-                <w:sz w:val="24"/>
-                <w:szCs w:val="24"/>
-                <w:lang w:val="en-GB"/>
-              </w:rPr>
-              <w:t>Payzone</w:t>
-            </w:r>
-            <w:proofErr w:type="spellEnd"/>
-            <w:r>
-              <w:rPr>
-                <w:sz w:val="24"/>
-                <w:szCs w:val="24"/>
-                <w:lang w:val="en-GB"/>
-              </w:rPr>
-              <w:t xml:space="preserve"> provide </w:t>
+            <w:r>
+              <w:rPr>
+                <w:sz w:val="24"/>
+                <w:szCs w:val="24"/>
+                <w:lang w:val="en-GB"/>
+              </w:rPr>
+              <w:t xml:space="preserve">Payzone provide </w:t>
             </w:r>
             <w:r>
               <w:rPr>
@@ -817,7 +826,15 @@
                 <w:szCs w:val="24"/>
                 <w:lang w:val="en-GB"/>
               </w:rPr>
-              <w:t>22</w:t>
+              <w:t>2</w:t>
+            </w:r>
+            <w:r>
+              <w:rPr>
+                <w:sz w:val="24"/>
+                <w:szCs w:val="24"/>
+                <w:lang w:val="en-GB"/>
+              </w:rPr>
+              <w:t>6</w:t>
             </w:r>
             <w:r>
               <w:rPr>
@@ -1361,7 +1378,16 @@
                 <w:szCs w:val="24"/>
                 <w:lang w:val="en-GB"/>
               </w:rPr>
-              <w:t>Git</w:t>
+              <w:t>Gi</w:t>
+            </w:r>
+            <w:r>
+              <w:rPr>
+                <w:b/>
+                <w:sz w:val="24"/>
+                <w:szCs w:val="24"/>
+                <w:lang w:val="en-GB"/>
+              </w:rPr>
+              <w:t>tLab</w:t>
             </w:r>
             <w:r>
               <w:rPr>
@@ -1378,7 +1404,7 @@
                 <w:szCs w:val="24"/>
                 <w:lang w:val="en-GB"/>
               </w:rPr>
-              <w:t>TeamCity</w:t>
+              <w:t>GitLab</w:t>
             </w:r>
             <w:r>
               <w:rPr>
@@ -1437,7 +1463,7 @@
                 <w:szCs w:val="24"/>
               </w:rPr>
             </w:pPr>
-            <w:hyperlink r:id="rId9" w:history="1">
+            <w:hyperlink r:id="rId10" w:history="1">
               <w:r>
                 <w:rPr>
                   <w:rStyle w:val="Hyperlink"/>
@@ -2349,7 +2375,7 @@
               </w:rPr>
               <w:t xml:space="preserve">Client: </w:t>
             </w:r>
-            <w:hyperlink r:id="rId10" w:history="1">
+            <w:hyperlink r:id="rId11" w:history="1">
               <w:r>
                 <w:rPr>
                   <w:rStyle w:val="Hyperlink"/>
@@ -2622,7 +2648,7 @@
               </w:rPr>
               <w:t xml:space="preserve">Client: </w:t>
             </w:r>
-            <w:hyperlink r:id="rId11" w:history="1">
+            <w:hyperlink r:id="rId12" w:history="1">
               <w:r>
                 <w:rPr>
                   <w:rStyle w:val="Hyperlink"/>
@@ -2950,7 +2976,7 @@
               </w:rPr>
               <w:t xml:space="preserve">Client: </w:t>
             </w:r>
-            <w:hyperlink r:id="rId12" w:history="1">
+            <w:hyperlink r:id="rId13" w:history="1">
               <w:proofErr w:type="spellStart"/>
               <w:r>
                 <w:rPr>
@@ -3229,7 +3255,7 @@
               <w:lastRenderedPageBreak/>
               <w:t xml:space="preserve">Client: </w:t>
             </w:r>
-            <w:hyperlink r:id="rId13" w:history="1">
+            <w:hyperlink r:id="rId14" w:history="1">
               <w:r>
                 <w:rPr>
                   <w:rStyle w:val="Hyperlink"/>
@@ -3518,7 +3544,7 @@
               </w:rPr>
               <w:t xml:space="preserve">Client: </w:t>
             </w:r>
-            <w:hyperlink r:id="rId14" w:history="1">
+            <w:hyperlink r:id="rId15" w:history="1">
               <w:r>
                 <w:rPr>
                   <w:rStyle w:val="Hyperlink"/>
@@ -3785,7 +3811,7 @@
                 <w:szCs w:val="24"/>
               </w:rPr>
             </w:pPr>
-            <w:hyperlink r:id="rId15" w:history="1">
+            <w:hyperlink r:id="rId16" w:history="1">
               <w:proofErr w:type="spellStart"/>
               <w:r>
                 <w:rPr>
@@ -4311,7 +4337,7 @@
               </w:rPr>
               <w:t>-Help Therapy Resources Service (</w:t>
             </w:r>
-            <w:hyperlink r:id="rId16" w:history="1">
+            <w:hyperlink r:id="rId17" w:history="1">
               <w:r>
                 <w:rPr>
                   <w:rStyle w:val="Hyperlink"/>
@@ -4319,7 +4345,25 @@
                   <w:szCs w:val="24"/>
                   <w:lang w:val="en-GB"/>
                 </w:rPr>
-                <w:t>https://www.RaptureTherapy.global/</w:t>
+                <w:t xml:space="preserve">Rapture </w:t>
+              </w:r>
+              <w:r>
+                <w:rPr>
+                  <w:rStyle w:val="Hyperlink"/>
+                  <w:sz w:val="24"/>
+                  <w:szCs w:val="24"/>
+                  <w:lang w:val="en-GB"/>
+                </w:rPr>
+                <w:t>T</w:t>
+              </w:r>
+              <w:r>
+                <w:rPr>
+                  <w:rStyle w:val="Hyperlink"/>
+                  <w:sz w:val="24"/>
+                  <w:szCs w:val="24"/>
+                  <w:lang w:val="en-GB"/>
+                </w:rPr>
+                <w:t>herapy</w:t>
               </w:r>
             </w:hyperlink>
             <w:r>
@@ -4998,7 +5042,7 @@
                 <w:szCs w:val="24"/>
               </w:rPr>
             </w:pPr>
-            <w:hyperlink r:id="rId17" w:history="1">
+            <w:hyperlink r:id="rId18" w:history="1">
               <w:r>
                 <w:rPr>
                   <w:rStyle w:val="Hyperlink"/>
@@ -5518,23 +5562,7 @@
                 <w:sz w:val="24"/>
                 <w:szCs w:val="24"/>
               </w:rPr>
-              <w:t xml:space="preserve">Later assisted a colleague </w:t>
-            </w:r>
-            <w:proofErr w:type="gramStart"/>
-            <w:r>
-              <w:rPr>
-                <w:sz w:val="24"/>
-                <w:szCs w:val="24"/>
-              </w:rPr>
-              <w:t>develop</w:t>
-            </w:r>
-            <w:proofErr w:type="gramEnd"/>
-            <w:r>
-              <w:rPr>
-                <w:sz w:val="24"/>
-                <w:szCs w:val="24"/>
-              </w:rPr>
-              <w:t xml:space="preserve"> another part of the system (Material Broker application).</w:t>
+              <w:t>Later assisted a colleague develop another part of the system (Material Broker application).</w:t>
             </w:r>
           </w:p>
           <w:p>
@@ -6314,7 +6342,7 @@
                 <w:szCs w:val="24"/>
               </w:rPr>
             </w:pPr>
-            <w:hyperlink r:id="rId18" w:history="1">
+            <w:hyperlink r:id="rId19" w:history="1">
               <w:proofErr w:type="spellStart"/>
               <w:r>
                 <w:rPr>
@@ -6903,8 +6931,8 @@
     </w:tbl>
     <w:p/>
     <w:sectPr>
-      <w:headerReference w:type="default" r:id="rId19"/>
-      <w:footerReference w:type="default" r:id="rId20"/>
+      <w:headerReference w:type="default" r:id="rId20"/>
+      <w:footerReference w:type="default" r:id="rId21"/>
       <w:footnotePr>
         <w:pos w:val="beneathText"/>
       </w:footnotePr>
@@ -6918,7 +6946,7 @@
 </file>
 
 <file path=word/endnotes.xml><?xml version="1.0" encoding="utf-8"?>
-<w:endnotes xmlns:wpc="http://schemas.microsoft.com/office/word/2010/wordprocessingCanvas" xmlns:cx="http://schemas.microsoft.com/office/drawing/2014/chartex" xmlns:cx1="http://schemas.microsoft.com/office/drawing/2015/9/8/chartex" xmlns:cx2="http://schemas.microsoft.com/office/drawing/2015/10/21/chartex" xmlns:cx3="http://schemas.microsoft.com/office/drawing/2016/5/9/chartex" xmlns:cx4="http://schemas.microsoft.com/office/drawing/2016/5/10/chartex" xmlns:cx5="http://schemas.microsoft.com/office/drawing/2016/5/11/chartex" xmlns:cx6="http://schemas.microsoft.com/office/drawing/2016/5/12/chartex" xmlns:cx7="http://schemas.microsoft.com/office/drawing/2016/5/13/chartex" xmlns:cx8="http://schemas.microsoft.com/office/drawing/2016/5/14/chartex" xmlns:mc="http://schemas.openxmlformats.org/markup-compatibility/2006" xmlns:aink="http://schemas.microsoft.com/office/drawing/2016/ink" xmlns:am3d="http://schemas.microsoft.com/office/drawing/2017/model3d" xmlns:o="urn:schemas-microsoft-com:office:office" xmlns:oel="http://schemas.microsoft.com/office/2019/extlst" xmlns:r="http://schemas.openxmlformats.org/officeDocument/2006/relationships" xmlns:m="http://schemas.openxmlformats.org/officeDocument/2006/math" xmlns:v="urn:schemas-microsoft-com:vml" xmlns:wp14="http://schemas.microsoft.com/office/word/2010/wordprocessingDrawing" xmlns:wp="http://schemas.openxmlformats.org/drawingml/2006/wordprocessingDrawing" xmlns:w10="urn:schemas-microsoft-com:office:word" xmlns:w="http://schemas.openxmlformats.org/wordprocessingml/2006/main" xmlns:w14="http://schemas.microsoft.com/office/word/2010/wordml" xmlns:w15="http://schemas.microsoft.com/office/word/2012/wordml" xmlns:w16cex="http://schemas.microsoft.com/office/word/2018/wordml/cex" xmlns:w16cid="http://schemas.microsoft.com/office/word/2016/wordml/cid" xmlns:w16="http://schemas.microsoft.com/office/word/2018/wordml" xmlns:w16sdtdh="http://schemas.microsoft.com/office/word/2020/wordml/sdtdatahash" xmlns:w16se="http://schemas.microsoft.com/office/word/2015/wordml/symex" xmlns:wpg="http://schemas.microsoft.com/office/word/2010/wordprocessingGroup" xmlns:wpi="http://schemas.microsoft.com/office/word/2010/wordprocessingInk" xmlns:wne="http://schemas.microsoft.com/office/word/2006/wordml" xmlns:wps="http://schemas.microsoft.com/office/word/2010/wordprocessingShape" mc:Ignorable="w14 w15 w16se w16cid w16 w16cex w16sdtdh wp14">
+<w:endnotes xmlns:wpc="http://schemas.microsoft.com/office/word/2010/wordprocessingCanvas" xmlns:cx="http://schemas.microsoft.com/office/drawing/2014/chartex" xmlns:cx1="http://schemas.microsoft.com/office/drawing/2015/9/8/chartex" xmlns:cx2="http://schemas.microsoft.com/office/drawing/2015/10/21/chartex" xmlns:cx3="http://schemas.microsoft.com/office/drawing/2016/5/9/chartex" xmlns:cx4="http://schemas.microsoft.com/office/drawing/2016/5/10/chartex" xmlns:cx5="http://schemas.microsoft.com/office/drawing/2016/5/11/chartex" xmlns:cx6="http://schemas.microsoft.com/office/drawing/2016/5/12/chartex" xmlns:cx7="http://schemas.microsoft.com/office/drawing/2016/5/13/chartex" xmlns:cx8="http://schemas.microsoft.com/office/drawing/2016/5/14/chartex" xmlns:mc="http://schemas.openxmlformats.org/markup-compatibility/2006" xmlns:aink="http://schemas.microsoft.com/office/drawing/2016/ink" xmlns:am3d="http://schemas.microsoft.com/office/drawing/2017/model3d" xmlns:o="urn:schemas-microsoft-com:office:office" xmlns:oel="http://schemas.microsoft.com/office/2019/extlst" xmlns:r="http://schemas.openxmlformats.org/officeDocument/2006/relationships" xmlns:m="http://schemas.openxmlformats.org/officeDocument/2006/math" xmlns:v="urn:schemas-microsoft-com:vml" xmlns:wp14="http://schemas.microsoft.com/office/word/2010/wordprocessingDrawing" xmlns:wp="http://schemas.openxmlformats.org/drawingml/2006/wordprocessingDrawing" xmlns:w10="urn:schemas-microsoft-com:office:word" xmlns:w="http://schemas.openxmlformats.org/wordprocessingml/2006/main" xmlns:w14="http://schemas.microsoft.com/office/word/2010/wordml" xmlns:w15="http://schemas.microsoft.com/office/word/2012/wordml" xmlns:w16cex="http://schemas.microsoft.com/office/word/2018/wordml/cex" xmlns:w16cid="http://schemas.microsoft.com/office/word/2016/wordml/cid" xmlns:w16="http://schemas.microsoft.com/office/word/2018/wordml" xmlns:w16du="http://schemas.microsoft.com/office/word/2023/wordml/word16du" xmlns:w16sdtdh="http://schemas.microsoft.com/office/word/2020/wordml/sdtdatahash" xmlns:w16sdtfl="http://schemas.microsoft.com/office/word/2024/wordml/sdtformatlock" xmlns:w16se="http://schemas.microsoft.com/office/word/2015/wordml/symex" xmlns:wpg="http://schemas.microsoft.com/office/word/2010/wordprocessingGroup" xmlns:wpi="http://schemas.microsoft.com/office/word/2010/wordprocessingInk" xmlns:wne="http://schemas.microsoft.com/office/word/2006/wordml" xmlns:wps="http://schemas.microsoft.com/office/word/2010/wordprocessingShape" mc:Ignorable="w14 w15 w16se w16cid w16 w16cex w16sdtdh w16sdtfl w16du wp14">
   <w:endnote w:type="separator" w:id="-1">
     <w:p>
       <w:r>
@@ -6937,7 +6965,7 @@
 </file>
 
 <file path=word/footer1.xml><?xml version="1.0" encoding="utf-8"?>
-<w:ftr xmlns:wpc="http://schemas.microsoft.com/office/word/2010/wordprocessingCanvas" xmlns:cx="http://schemas.microsoft.com/office/drawing/2014/chartex" xmlns:cx1="http://schemas.microsoft.com/office/drawing/2015/9/8/chartex" xmlns:cx2="http://schemas.microsoft.com/office/drawing/2015/10/21/chartex" xmlns:cx3="http://schemas.microsoft.com/office/drawing/2016/5/9/chartex" xmlns:cx4="http://schemas.microsoft.com/office/drawing/2016/5/10/chartex" xmlns:cx5="http://schemas.microsoft.com/office/drawing/2016/5/11/chartex" xmlns:cx6="http://schemas.microsoft.com/office/drawing/2016/5/12/chartex" xmlns:cx7="http://schemas.microsoft.com/office/drawing/2016/5/13/chartex" xmlns:cx8="http://schemas.microsoft.com/office/drawing/2016/5/14/chartex" xmlns:mc="http://schemas.openxmlformats.org/markup-compatibility/2006" xmlns:aink="http://schemas.microsoft.com/office/drawing/2016/ink" xmlns:am3d="http://schemas.microsoft.com/office/drawing/2017/model3d" xmlns:o="urn:schemas-microsoft-com:office:office" xmlns:oel="http://schemas.microsoft.com/office/2019/extlst" xmlns:r="http://schemas.openxmlformats.org/officeDocument/2006/relationships" xmlns:m="http://schemas.openxmlformats.org/officeDocument/2006/math" xmlns:v="urn:schemas-microsoft-com:vml" xmlns:wp14="http://schemas.microsoft.com/office/word/2010/wordprocessingDrawing" xmlns:wp="http://schemas.openxmlformats.org/drawingml/2006/wordprocessingDrawing" xmlns:w10="urn:schemas-microsoft-com:office:word" xmlns:w="http://schemas.openxmlformats.org/wordprocessingml/2006/main" xmlns:w14="http://schemas.microsoft.com/office/word/2010/wordml" xmlns:w15="http://schemas.microsoft.com/office/word/2012/wordml" xmlns:w16cex="http://schemas.microsoft.com/office/word/2018/wordml/cex" xmlns:w16cid="http://schemas.microsoft.com/office/word/2016/wordml/cid" xmlns:w16="http://schemas.microsoft.com/office/word/2018/wordml" xmlns:w16sdtdh="http://schemas.microsoft.com/office/word/2020/wordml/sdtdatahash" xmlns:w16se="http://schemas.microsoft.com/office/word/2015/wordml/symex" xmlns:wpg="http://schemas.microsoft.com/office/word/2010/wordprocessingGroup" xmlns:wpi="http://schemas.microsoft.com/office/word/2010/wordprocessingInk" xmlns:wne="http://schemas.microsoft.com/office/word/2006/wordml" xmlns:wps="http://schemas.microsoft.com/office/word/2010/wordprocessingShape" mc:Ignorable="w14 w15 w16se w16cid w16 w16cex w16sdtdh wp14">
+<w:ftr xmlns:wpc="http://schemas.microsoft.com/office/word/2010/wordprocessingCanvas" xmlns:cx="http://schemas.microsoft.com/office/drawing/2014/chartex" xmlns:cx1="http://schemas.microsoft.com/office/drawing/2015/9/8/chartex" xmlns:cx2="http://schemas.microsoft.com/office/drawing/2015/10/21/chartex" xmlns:cx3="http://schemas.microsoft.com/office/drawing/2016/5/9/chartex" xmlns:cx4="http://schemas.microsoft.com/office/drawing/2016/5/10/chartex" xmlns:cx5="http://schemas.microsoft.com/office/drawing/2016/5/11/chartex" xmlns:cx6="http://schemas.microsoft.com/office/drawing/2016/5/12/chartex" xmlns:cx7="http://schemas.microsoft.com/office/drawing/2016/5/13/chartex" xmlns:cx8="http://schemas.microsoft.com/office/drawing/2016/5/14/chartex" xmlns:mc="http://schemas.openxmlformats.org/markup-compatibility/2006" xmlns:aink="http://schemas.microsoft.com/office/drawing/2016/ink" xmlns:am3d="http://schemas.microsoft.com/office/drawing/2017/model3d" xmlns:o="urn:schemas-microsoft-com:office:office" xmlns:oel="http://schemas.microsoft.com/office/2019/extlst" xmlns:r="http://schemas.openxmlformats.org/officeDocument/2006/relationships" xmlns:m="http://schemas.openxmlformats.org/officeDocument/2006/math" xmlns:v="urn:schemas-microsoft-com:vml" xmlns:wp14="http://schemas.microsoft.com/office/word/2010/wordprocessingDrawing" xmlns:wp="http://schemas.openxmlformats.org/drawingml/2006/wordprocessingDrawing" xmlns:w10="urn:schemas-microsoft-com:office:word" xmlns:w="http://schemas.openxmlformats.org/wordprocessingml/2006/main" xmlns:w14="http://schemas.microsoft.com/office/word/2010/wordml" xmlns:w15="http://schemas.microsoft.com/office/word/2012/wordml" xmlns:w16cex="http://schemas.microsoft.com/office/word/2018/wordml/cex" xmlns:w16cid="http://schemas.microsoft.com/office/word/2016/wordml/cid" xmlns:w16="http://schemas.microsoft.com/office/word/2018/wordml" xmlns:w16du="http://schemas.microsoft.com/office/word/2023/wordml/word16du" xmlns:w16sdtdh="http://schemas.microsoft.com/office/word/2020/wordml/sdtdatahash" xmlns:w16sdtfl="http://schemas.microsoft.com/office/word/2024/wordml/sdtformatlock" xmlns:w16se="http://schemas.microsoft.com/office/word/2015/wordml/symex" xmlns:wpg="http://schemas.microsoft.com/office/word/2010/wordprocessingGroup" xmlns:wpi="http://schemas.microsoft.com/office/word/2010/wordprocessingInk" xmlns:wne="http://schemas.microsoft.com/office/word/2006/wordml" xmlns:wps="http://schemas.microsoft.com/office/word/2010/wordprocessingShape" mc:Ignorable="w14 w15 w16se w16cid w16 w16cex w16sdtdh w16sdtfl w16du wp14">
   <w:p>
     <w:pPr>
       <w:spacing w:before="140" w:line="100" w:lineRule="exact"/>
@@ -6980,7 +7008,7 @@
 </file>
 
 <file path=word/footnotes.xml><?xml version="1.0" encoding="utf-8"?>
-<w:footnotes xmlns:wpc="http://schemas.microsoft.com/office/word/2010/wordprocessingCanvas" xmlns:cx="http://schemas.microsoft.com/office/drawing/2014/chartex" xmlns:cx1="http://schemas.microsoft.com/office/drawing/2015/9/8/chartex" xmlns:cx2="http://schemas.microsoft.com/office/drawing/2015/10/21/chartex" xmlns:cx3="http://schemas.microsoft.com/office/drawing/2016/5/9/chartex" xmlns:cx4="http://schemas.microsoft.com/office/drawing/2016/5/10/chartex" xmlns:cx5="http://schemas.microsoft.com/office/drawing/2016/5/11/chartex" xmlns:cx6="http://schemas.microsoft.com/office/drawing/2016/5/12/chartex" xmlns:cx7="http://schemas.microsoft.com/office/drawing/2016/5/13/chartex" xmlns:cx8="http://schemas.microsoft.com/office/drawing/2016/5/14/chartex" xmlns:mc="http://schemas.openxmlformats.org/markup-compatibility/2006" xmlns:aink="http://schemas.microsoft.com/office/drawing/2016/ink" xmlns:am3d="http://schemas.microsoft.com/office/drawing/2017/model3d" xmlns:o="urn:schemas-microsoft-com:office:office" xmlns:oel="http://schemas.microsoft.com/office/2019/extlst" xmlns:r="http://schemas.openxmlformats.org/officeDocument/2006/relationships" xmlns:m="http://schemas.openxmlformats.org/officeDocument/2006/math" xmlns:v="urn:schemas-microsoft-com:vml" xmlns:wp14="http://schemas.microsoft.com/office/word/2010/wordprocessingDrawing" xmlns:wp="http://schemas.openxmlformats.org/drawingml/2006/wordprocessingDrawing" xmlns:w10="urn:schemas-microsoft-com:office:word" xmlns:w="http://schemas.openxmlformats.org/wordprocessingml/2006/main" xmlns:w14="http://schemas.microsoft.com/office/word/2010/wordml" xmlns:w15="http://schemas.microsoft.com/office/word/2012/wordml" xmlns:w16cex="http://schemas.microsoft.com/office/word/2018/wordml/cex" xmlns:w16cid="http://schemas.microsoft.com/office/word/2016/wordml/cid" xmlns:w16="http://schemas.microsoft.com/office/word/2018/wordml" xmlns:w16sdtdh="http://schemas.microsoft.com/office/word/2020/wordml/sdtdatahash" xmlns:w16se="http://schemas.microsoft.com/office/word/2015/wordml/symex" xmlns:wpg="http://schemas.microsoft.com/office/word/2010/wordprocessingGroup" xmlns:wpi="http://schemas.microsoft.com/office/word/2010/wordprocessingInk" xmlns:wne="http://schemas.microsoft.com/office/word/2006/wordml" xmlns:wps="http://schemas.microsoft.com/office/word/2010/wordprocessingShape" mc:Ignorable="w14 w15 w16se w16cid w16 w16cex w16sdtdh wp14">
+<w:footnotes xmlns:wpc="http://schemas.microsoft.com/office/word/2010/wordprocessingCanvas" xmlns:cx="http://schemas.microsoft.com/office/drawing/2014/chartex" xmlns:cx1="http://schemas.microsoft.com/office/drawing/2015/9/8/chartex" xmlns:cx2="http://schemas.microsoft.com/office/drawing/2015/10/21/chartex" xmlns:cx3="http://schemas.microsoft.com/office/drawing/2016/5/9/chartex" xmlns:cx4="http://schemas.microsoft.com/office/drawing/2016/5/10/chartex" xmlns:cx5="http://schemas.microsoft.com/office/drawing/2016/5/11/chartex" xmlns:cx6="http://schemas.microsoft.com/office/drawing/2016/5/12/chartex" xmlns:cx7="http://schemas.microsoft.com/office/drawing/2016/5/13/chartex" xmlns:cx8="http://schemas.microsoft.com/office/drawing/2016/5/14/chartex" xmlns:mc="http://schemas.openxmlformats.org/markup-compatibility/2006" xmlns:aink="http://schemas.microsoft.com/office/drawing/2016/ink" xmlns:am3d="http://schemas.microsoft.com/office/drawing/2017/model3d" xmlns:o="urn:schemas-microsoft-com:office:office" xmlns:oel="http://schemas.microsoft.com/office/2019/extlst" xmlns:r="http://schemas.openxmlformats.org/officeDocument/2006/relationships" xmlns:m="http://schemas.openxmlformats.org/officeDocument/2006/math" xmlns:v="urn:schemas-microsoft-com:vml" xmlns:wp14="http://schemas.microsoft.com/office/word/2010/wordprocessingDrawing" xmlns:wp="http://schemas.openxmlformats.org/drawingml/2006/wordprocessingDrawing" xmlns:w10="urn:schemas-microsoft-com:office:word" xmlns:w="http://schemas.openxmlformats.org/wordprocessingml/2006/main" xmlns:w14="http://schemas.microsoft.com/office/word/2010/wordml" xmlns:w15="http://schemas.microsoft.com/office/word/2012/wordml" xmlns:w16cex="http://schemas.microsoft.com/office/word/2018/wordml/cex" xmlns:w16cid="http://schemas.microsoft.com/office/word/2016/wordml/cid" xmlns:w16="http://schemas.microsoft.com/office/word/2018/wordml" xmlns:w16du="http://schemas.microsoft.com/office/word/2023/wordml/word16du" xmlns:w16sdtdh="http://schemas.microsoft.com/office/word/2020/wordml/sdtdatahash" xmlns:w16sdtfl="http://schemas.microsoft.com/office/word/2024/wordml/sdtformatlock" xmlns:w16se="http://schemas.microsoft.com/office/word/2015/wordml/symex" xmlns:wpg="http://schemas.microsoft.com/office/word/2010/wordprocessingGroup" xmlns:wpi="http://schemas.microsoft.com/office/word/2010/wordprocessingInk" xmlns:wne="http://schemas.microsoft.com/office/word/2006/wordml" xmlns:wps="http://schemas.microsoft.com/office/word/2010/wordprocessingShape" mc:Ignorable="w14 w15 w16se w16cid w16 w16cex w16sdtdh w16sdtfl w16du wp14">
   <w:footnote w:type="separator" w:id="-1">
     <w:p>
       <w:r>
@@ -6999,7 +7027,7 @@
 </file>
 
 <file path=word/header1.xml><?xml version="1.0" encoding="utf-8"?>
-<w:hdr xmlns:wpc="http://schemas.microsoft.com/office/word/2010/wordprocessingCanvas" xmlns:cx="http://schemas.microsoft.com/office/drawing/2014/chartex" xmlns:cx1="http://schemas.microsoft.com/office/drawing/2015/9/8/chartex" xmlns:cx2="http://schemas.microsoft.com/office/drawing/2015/10/21/chartex" xmlns:cx3="http://schemas.microsoft.com/office/drawing/2016/5/9/chartex" xmlns:cx4="http://schemas.microsoft.com/office/drawing/2016/5/10/chartex" xmlns:cx5="http://schemas.microsoft.com/office/drawing/2016/5/11/chartex" xmlns:cx6="http://schemas.microsoft.com/office/drawing/2016/5/12/chartex" xmlns:cx7="http://schemas.microsoft.com/office/drawing/2016/5/13/chartex" xmlns:cx8="http://schemas.microsoft.com/office/drawing/2016/5/14/chartex" xmlns:mc="http://schemas.openxmlformats.org/markup-compatibility/2006" xmlns:aink="http://schemas.microsoft.com/office/drawing/2016/ink" xmlns:am3d="http://schemas.microsoft.com/office/drawing/2017/model3d" xmlns:o="urn:schemas-microsoft-com:office:office" xmlns:oel="http://schemas.microsoft.com/office/2019/extlst" xmlns:r="http://schemas.openxmlformats.org/officeDocument/2006/relationships" xmlns:m="http://schemas.openxmlformats.org/officeDocument/2006/math" xmlns:v="urn:schemas-microsoft-com:vml" xmlns:wp14="http://schemas.microsoft.com/office/word/2010/wordprocessingDrawing" xmlns:wp="http://schemas.openxmlformats.org/drawingml/2006/wordprocessingDrawing" xmlns:w10="urn:schemas-microsoft-com:office:word" xmlns:w="http://schemas.openxmlformats.org/wordprocessingml/2006/main" xmlns:w14="http://schemas.microsoft.com/office/word/2010/wordml" xmlns:w15="http://schemas.microsoft.com/office/word/2012/wordml" xmlns:w16cex="http://schemas.microsoft.com/office/word/2018/wordml/cex" xmlns:w16cid="http://schemas.microsoft.com/office/word/2016/wordml/cid" xmlns:w16="http://schemas.microsoft.com/office/word/2018/wordml" xmlns:w16sdtdh="http://schemas.microsoft.com/office/word/2020/wordml/sdtdatahash" xmlns:w16se="http://schemas.microsoft.com/office/word/2015/wordml/symex" xmlns:wpg="http://schemas.microsoft.com/office/word/2010/wordprocessingGroup" xmlns:wpi="http://schemas.microsoft.com/office/word/2010/wordprocessingInk" xmlns:wne="http://schemas.microsoft.com/office/word/2006/wordml" xmlns:wps="http://schemas.microsoft.com/office/word/2010/wordprocessingShape" mc:Ignorable="w14 w15 w16se w16cid w16 w16cex w16sdtdh wp14">
+<w:hdr xmlns:wpc="http://schemas.microsoft.com/office/word/2010/wordprocessingCanvas" xmlns:cx="http://schemas.microsoft.com/office/drawing/2014/chartex" xmlns:cx1="http://schemas.microsoft.com/office/drawing/2015/9/8/chartex" xmlns:cx2="http://schemas.microsoft.com/office/drawing/2015/10/21/chartex" xmlns:cx3="http://schemas.microsoft.com/office/drawing/2016/5/9/chartex" xmlns:cx4="http://schemas.microsoft.com/office/drawing/2016/5/10/chartex" xmlns:cx5="http://schemas.microsoft.com/office/drawing/2016/5/11/chartex" xmlns:cx6="http://schemas.microsoft.com/office/drawing/2016/5/12/chartex" xmlns:cx7="http://schemas.microsoft.com/office/drawing/2016/5/13/chartex" xmlns:cx8="http://schemas.microsoft.com/office/drawing/2016/5/14/chartex" xmlns:mc="http://schemas.openxmlformats.org/markup-compatibility/2006" xmlns:aink="http://schemas.microsoft.com/office/drawing/2016/ink" xmlns:am3d="http://schemas.microsoft.com/office/drawing/2017/model3d" xmlns:o="urn:schemas-microsoft-com:office:office" xmlns:oel="http://schemas.microsoft.com/office/2019/extlst" xmlns:r="http://schemas.openxmlformats.org/officeDocument/2006/relationships" xmlns:m="http://schemas.openxmlformats.org/officeDocument/2006/math" xmlns:v="urn:schemas-microsoft-com:vml" xmlns:wp14="http://schemas.microsoft.com/office/word/2010/wordprocessingDrawing" xmlns:wp="http://schemas.openxmlformats.org/drawingml/2006/wordprocessingDrawing" xmlns:w10="urn:schemas-microsoft-com:office:word" xmlns:w="http://schemas.openxmlformats.org/wordprocessingml/2006/main" xmlns:w14="http://schemas.microsoft.com/office/word/2010/wordml" xmlns:w15="http://schemas.microsoft.com/office/word/2012/wordml" xmlns:w16cex="http://schemas.microsoft.com/office/word/2018/wordml/cex" xmlns:w16cid="http://schemas.microsoft.com/office/word/2016/wordml/cid" xmlns:w16="http://schemas.microsoft.com/office/word/2018/wordml" xmlns:w16du="http://schemas.microsoft.com/office/word/2023/wordml/word16du" xmlns:w16sdtdh="http://schemas.microsoft.com/office/word/2020/wordml/sdtdatahash" xmlns:w16sdtfl="http://schemas.microsoft.com/office/word/2024/wordml/sdtformatlock" xmlns:w16se="http://schemas.microsoft.com/office/word/2015/wordml/symex" xmlns:wpg="http://schemas.microsoft.com/office/word/2010/wordprocessingGroup" xmlns:wpi="http://schemas.microsoft.com/office/word/2010/wordprocessingInk" xmlns:wne="http://schemas.microsoft.com/office/word/2006/wordml" xmlns:wps="http://schemas.microsoft.com/office/word/2010/wordprocessingShape" mc:Ignorable="w14 w15 w16se w16cid w16 w16cex w16sdtdh w16sdtfl w16du wp14">
   <w:p>
     <w:pPr>
       <w:tabs>
@@ -7149,7 +7177,7 @@
         <w:sz w:val="19"/>
         <w:lang w:val="en-GB"/>
       </w:rPr>
-      <w:t>6-October-2023</w:t>
+      <w:t>23-October-2026</w:t>
     </w:r>
     <w:r>
       <w:rPr>
@@ -7163,7 +7191,7 @@
 </file>
 
 <file path=word/numbering.xml><?xml version="1.0" encoding="utf-8"?>
-<w:numbering xmlns:wpc="http://schemas.microsoft.com/office/word/2010/wordprocessingCanvas" xmlns:cx="http://schemas.microsoft.com/office/drawing/2014/chartex" xmlns:cx1="http://schemas.microsoft.com/office/drawing/2015/9/8/chartex" xmlns:cx2="http://schemas.microsoft.com/office/drawing/2015/10/21/chartex" xmlns:cx3="http://schemas.microsoft.com/office/drawing/2016/5/9/chartex" xmlns:cx4="http://schemas.microsoft.com/office/drawing/2016/5/10/chartex" xmlns:cx5="http://schemas.microsoft.com/office/drawing/2016/5/11/chartex" xmlns:cx6="http://schemas.microsoft.com/office/drawing/2016/5/12/chartex" xmlns:cx7="http://schemas.microsoft.com/office/drawing/2016/5/13/chartex" xmlns:cx8="http://schemas.microsoft.com/office/drawing/2016/5/14/chartex" xmlns:mc="http://schemas.openxmlformats.org/markup-compatibility/2006" xmlns:aink="http://schemas.microsoft.com/office/drawing/2016/ink" xmlns:am3d="http://schemas.microsoft.com/office/drawing/2017/model3d" xmlns:o="urn:schemas-microsoft-com:office:office" xmlns:oel="http://schemas.microsoft.com/office/2019/extlst" xmlns:r="http://schemas.openxmlformats.org/officeDocument/2006/relationships" xmlns:m="http://schemas.openxmlformats.org/officeDocument/2006/math" xmlns:v="urn:schemas-microsoft-com:vml" xmlns:wp14="http://schemas.microsoft.com/office/word/2010/wordprocessingDrawing" xmlns:wp="http://schemas.openxmlformats.org/drawingml/2006/wordprocessingDrawing" xmlns:w10="urn:schemas-microsoft-com:office:word" xmlns:w="http://schemas.openxmlformats.org/wordprocessingml/2006/main" xmlns:w14="http://schemas.microsoft.com/office/word/2010/wordml" xmlns:w15="http://schemas.microsoft.com/office/word/2012/wordml" xmlns:w16cex="http://schemas.microsoft.com/office/word/2018/wordml/cex" xmlns:w16cid="http://schemas.microsoft.com/office/word/2016/wordml/cid" xmlns:w16="http://schemas.microsoft.com/office/word/2018/wordml" xmlns:w16sdtdh="http://schemas.microsoft.com/office/word/2020/wordml/sdtdatahash" xmlns:w16se="http://schemas.microsoft.com/office/word/2015/wordml/symex" xmlns:wpg="http://schemas.microsoft.com/office/word/2010/wordprocessingGroup" xmlns:wpi="http://schemas.microsoft.com/office/word/2010/wordprocessingInk" xmlns:wne="http://schemas.microsoft.com/office/word/2006/wordml" xmlns:wps="http://schemas.microsoft.com/office/word/2010/wordprocessingShape" mc:Ignorable="w14 w15 w16se w16cid w16 w16cex w16sdtdh wp14">
+<w:numbering xmlns:wpc="http://schemas.microsoft.com/office/word/2010/wordprocessingCanvas" xmlns:cx="http://schemas.microsoft.com/office/drawing/2014/chartex" xmlns:cx1="http://schemas.microsoft.com/office/drawing/2015/9/8/chartex" xmlns:cx2="http://schemas.microsoft.com/office/drawing/2015/10/21/chartex" xmlns:cx3="http://schemas.microsoft.com/office/drawing/2016/5/9/chartex" xmlns:cx4="http://schemas.microsoft.com/office/drawing/2016/5/10/chartex" xmlns:cx5="http://schemas.microsoft.com/office/drawing/2016/5/11/chartex" xmlns:cx6="http://schemas.microsoft.com/office/drawing/2016/5/12/chartex" xmlns:cx7="http://schemas.microsoft.com/office/drawing/2016/5/13/chartex" xmlns:cx8="http://schemas.microsoft.com/office/drawing/2016/5/14/chartex" xmlns:mc="http://schemas.openxmlformats.org/markup-compatibility/2006" xmlns:aink="http://schemas.microsoft.com/office/drawing/2016/ink" xmlns:am3d="http://schemas.microsoft.com/office/drawing/2017/model3d" xmlns:o="urn:schemas-microsoft-com:office:office" xmlns:oel="http://schemas.microsoft.com/office/2019/extlst" xmlns:r="http://schemas.openxmlformats.org/officeDocument/2006/relationships" xmlns:m="http://schemas.openxmlformats.org/officeDocument/2006/math" xmlns:v="urn:schemas-microsoft-com:vml" xmlns:wp14="http://schemas.microsoft.com/office/word/2010/wordprocessingDrawing" xmlns:wp="http://schemas.openxmlformats.org/drawingml/2006/wordprocessingDrawing" xmlns:w10="urn:schemas-microsoft-com:office:word" xmlns:w="http://schemas.openxmlformats.org/wordprocessingml/2006/main" xmlns:w14="http://schemas.microsoft.com/office/word/2010/wordml" xmlns:w15="http://schemas.microsoft.com/office/word/2012/wordml" xmlns:w16cex="http://schemas.microsoft.com/office/word/2018/wordml/cex" xmlns:w16cid="http://schemas.microsoft.com/office/word/2016/wordml/cid" xmlns:w16="http://schemas.microsoft.com/office/word/2018/wordml" xmlns:w16du="http://schemas.microsoft.com/office/word/2023/wordml/word16du" xmlns:w16sdtdh="http://schemas.microsoft.com/office/word/2020/wordml/sdtdatahash" xmlns:w16sdtfl="http://schemas.microsoft.com/office/word/2024/wordml/sdtformatlock" xmlns:w16se="http://schemas.microsoft.com/office/word/2015/wordml/symex" xmlns:wpg="http://schemas.microsoft.com/office/word/2010/wordprocessingGroup" xmlns:wpi="http://schemas.microsoft.com/office/word/2010/wordprocessingInk" xmlns:wne="http://schemas.microsoft.com/office/word/2006/wordml" xmlns:wps="http://schemas.microsoft.com/office/word/2010/wordprocessingShape" mc:Ignorable="w14 w15 w16se w16cid w16 w16cex w16sdtdh w16sdtfl w16du wp14">
   <w:abstractNum w:abstractNumId="0" w15:restartNumberingAfterBreak="0">
     <w:nsid w:val="00000001"/>
     <w:multiLevelType w:val="singleLevel"/>
@@ -7455,7 +7483,7 @@
 </file>
 
 <file path=word/styles.xml><?xml version="1.0" encoding="utf-8"?>
-<w:styles xmlns:mc="http://schemas.openxmlformats.org/markup-compatibility/2006" xmlns:r="http://schemas.openxmlformats.org/officeDocument/2006/relationships" xmlns:w="http://schemas.openxmlformats.org/wordprocessingml/2006/main" xmlns:w14="http://schemas.microsoft.com/office/word/2010/wordml" xmlns:w15="http://schemas.microsoft.com/office/word/2012/wordml" xmlns:w16cex="http://schemas.microsoft.com/office/word/2018/wordml/cex" xmlns:w16cid="http://schemas.microsoft.com/office/word/2016/wordml/cid" xmlns:w16="http://schemas.microsoft.com/office/word/2018/wordml" xmlns:w16sdtdh="http://schemas.microsoft.com/office/word/2020/wordml/sdtdatahash" xmlns:w16se="http://schemas.microsoft.com/office/word/2015/wordml/symex" mc:Ignorable="w14 w15 w16se w16cid w16 w16cex w16sdtdh">
+<w:styles xmlns:mc="http://schemas.openxmlformats.org/markup-compatibility/2006" xmlns:r="http://schemas.openxmlformats.org/officeDocument/2006/relationships" xmlns:w="http://schemas.openxmlformats.org/wordprocessingml/2006/main" xmlns:w14="http://schemas.microsoft.com/office/word/2010/wordml" xmlns:w15="http://schemas.microsoft.com/office/word/2012/wordml" xmlns:w16cex="http://schemas.microsoft.com/office/word/2018/wordml/cex" xmlns:w16cid="http://schemas.microsoft.com/office/word/2016/wordml/cid" xmlns:w16="http://schemas.microsoft.com/office/word/2018/wordml" xmlns:w16du="http://schemas.microsoft.com/office/word/2023/wordml/word16du" xmlns:w16sdtdh="http://schemas.microsoft.com/office/word/2020/wordml/sdtdatahash" xmlns:w16sdtfl="http://schemas.microsoft.com/office/word/2024/wordml/sdtformatlock" xmlns:w16se="http://schemas.microsoft.com/office/word/2015/wordml/symex" mc:Ignorable="w14 w15 w16se w16cid w16 w16cex w16sdtdh w16sdtfl w16du">
   <w:docDefaults>
     <w:rPrDefault>
       <w:rPr>
@@ -8686,4 +8714,16 @@
     </a:ext>
   </a:extLst>
 </a:theme>
+</file>
+
+<file path=customXml/item1.xml><?xml version="1.0" encoding="utf-8"?>
+<b:Sources xmlns:b="http://schemas.openxmlformats.org/officeDocument/2006/bibliography" xmlns="http://schemas.openxmlformats.org/officeDocument/2006/bibliography" SelectedStyle="\APASixthEditionOfficeOnline.xsl" StyleName="APA" Version="6"/>
+</file>
+
+<file path=customXml/itemProps1.xml><?xml version="1.0" encoding="utf-8"?>
+<ds:datastoreItem xmlns:ds="http://schemas.openxmlformats.org/officeDocument/2006/customXml" ds:itemID="{CFA290B7-0B17-4370-B877-95260AC2F7B3}">
+  <ds:schemaRefs>
+    <ds:schemaRef ds:uri="http://schemas.openxmlformats.org/officeDocument/2006/bibliography"/>
+  </ds:schemaRefs>
+</ds:datastoreItem>
 </file>
</xml_diff>

<commit_message>
chore: Fixed an outdated reference to TeamCity.
</commit_message>
<xml_diff>
--- a/EamonnDuffyCV-Long.docx
+++ b/EamonnDuffyCV-Long.docx
@@ -288,7 +288,7 @@
                 <w:sz w:val="24"/>
                 <w:szCs w:val="24"/>
               </w:rPr>
-              <w:t>TeamCity</w:t>
+              <w:t>GitLab</w:t>
             </w:r>
             <w:r>
               <w:rPr>
@@ -4345,25 +4345,7 @@
                   <w:szCs w:val="24"/>
                   <w:lang w:val="en-GB"/>
                 </w:rPr>
-                <w:t xml:space="preserve">Rapture </w:t>
-              </w:r>
-              <w:r>
-                <w:rPr>
-                  <w:rStyle w:val="Hyperlink"/>
-                  <w:sz w:val="24"/>
-                  <w:szCs w:val="24"/>
-                  <w:lang w:val="en-GB"/>
-                </w:rPr>
-                <w:t>T</w:t>
-              </w:r>
-              <w:r>
-                <w:rPr>
-                  <w:rStyle w:val="Hyperlink"/>
-                  <w:sz w:val="24"/>
-                  <w:szCs w:val="24"/>
-                  <w:lang w:val="en-GB"/>
-                </w:rPr>
-                <w:t>herapy</w:t>
+                <w:t>Rapture Therapy</w:t>
               </w:r>
             </w:hyperlink>
             <w:r>

</xml_diff>

<commit_message>
feat: Added some PostgreSQL experience. Perhaps should mention Eadent.Common and Eadent.Identity?
</commit_message>
<xml_diff>
--- a/EamonnDuffyCV-Long.docx
+++ b/EamonnDuffyCV-Long.docx
@@ -232,7 +232,21 @@
                 <w:sz w:val="24"/>
                 <w:szCs w:val="24"/>
               </w:rPr>
-              <w:t>MVC &amp; Web API; SQL Server; Windows Services; RESTful Web Services</w:t>
+              <w:t xml:space="preserve">MVC &amp; Web API; SQL Server; </w:t>
+            </w:r>
+            <w:r>
+              <w:rPr>
+                <w:sz w:val="24"/>
+                <w:szCs w:val="24"/>
+              </w:rPr>
+              <w:t xml:space="preserve">PostgreSQL; </w:t>
+            </w:r>
+            <w:r>
+              <w:rPr>
+                <w:sz w:val="24"/>
+                <w:szCs w:val="24"/>
+              </w:rPr>
+              <w:t>Windows Services; RESTful Web Services</w:t>
             </w:r>
             <w:r>
               <w:rPr>
@@ -4390,7 +4404,35 @@
                 <w:szCs w:val="24"/>
                 <w:lang w:val="en-GB"/>
               </w:rPr>
-              <w:t>SQL</w:t>
+              <w:t>SQ</w:t>
+            </w:r>
+            <w:r>
+              <w:rPr>
+                <w:b/>
+                <w:bCs/>
+                <w:sz w:val="24"/>
+                <w:szCs w:val="24"/>
+                <w:lang w:val="en-GB"/>
+              </w:rPr>
+              <w:t>L Server</w:t>
+            </w:r>
+            <w:r>
+              <w:rPr>
+                <w:sz w:val="24"/>
+                <w:szCs w:val="24"/>
+                <w:lang w:val="en-GB"/>
+              </w:rPr>
+              <w:t xml:space="preserve">, </w:t>
+            </w:r>
+            <w:r>
+              <w:rPr>
+                <w:b/>
+                <w:bCs/>
+                <w:sz w:val="24"/>
+                <w:szCs w:val="24"/>
+                <w:lang w:val="en-GB"/>
+              </w:rPr>
+              <w:t>PostgreSQL</w:t>
             </w:r>
             <w:r>
               <w:rPr>

</xml_diff>